<commit_message>
Added performance testing and manual testing
</commit_message>
<xml_diff>
--- a/Documents/Gurvinder Kaur - Individual Project Report - v5.docx
+++ b/Documents/Gurvinder Kaur - Individual Project Report - v5.docx
@@ -18185,130 +18185,925 @@
     <w:p>
       <w:pPr>
         <w:pStyle w:val="Heading3"/>
-        <w:rPr>
-          <w:rStyle w:val="SubtleEmphasis"/>
-          <w:i w:val="0"/>
-          <w:iCs w:val="0"/>
-        </w:rPr>
       </w:pPr>
-      <w:bookmarkStart w:id="70" w:name="_Toc387605646"/>
-      <w:r>
-        <w:rPr>
-          <w:rStyle w:val="SubtleEmphasis"/>
-          <w:i w:val="0"/>
-          <w:iCs w:val="0"/>
-        </w:rPr>
+      <w:r>
         <w:lastRenderedPageBreak/>
-        <w:t>System development</w:t>
-      </w:r>
-      <w:bookmarkEnd w:id="70"/>
-      <w:r>
-        <w:rPr>
-          <w:rStyle w:val="SubtleEmphasis"/>
-          <w:i w:val="0"/>
-          <w:iCs w:val="0"/>
-        </w:rPr>
+        <w:t>Working environment</w:t>
+      </w:r>
+      <w:r>
         <w:t xml:space="preserve"> </w:t>
       </w:r>
     </w:p>
     <w:p>
       <w:r>
-        <w:t xml:space="preserve">This was the first time the author was indulging in technologies such as JSPs and Servlets and Apache Tomcat. It was a huge learning curve as the author combined JSPs and Servlets with </w:t>
-      </w:r>
-      <w:r>
-        <w:t xml:space="preserve">HTML and CSS running </w:t>
-      </w:r>
-      <w:r>
-        <w:t>on</w:t>
-      </w:r>
-      <w:r>
-        <w:t xml:space="preserve"> </w:t>
-      </w:r>
-      <w:r>
-        <w:t>Apache</w:t>
-      </w:r>
-      <w:r>
-        <w:t xml:space="preserve"> Tomcat and MySQL servers.</w:t>
-      </w:r>
-      <w:bookmarkStart w:id="71" w:name="_GoBack"/>
-      <w:bookmarkEnd w:id="71"/>
+        <w:t xml:space="preserve">The author decided to use an Eclipse environment couples with </w:t>
+      </w:r>
+      <w:proofErr w:type="gramStart"/>
+      <w:r>
+        <w:t>a</w:t>
+      </w:r>
+      <w:proofErr w:type="gramEnd"/>
+      <w:r>
+        <w:t xml:space="preserve"> Apache Tomcat server and a MySQL database server. The author did not have any past experience in these technologies, but found it to be the most common combination that offered help so decided to use that combination. In the resources you can find tutorials the author followed in order to have the Tom</w:t>
+      </w:r>
+      <w:r>
+        <w:t>c</w:t>
+      </w:r>
+      <w:r>
+        <w:t xml:space="preserve">at and MySQL servers connected and running on Eclipse. </w:t>
+      </w:r>
     </w:p>
     <w:p>
       <w:pPr>
         <w:pStyle w:val="Heading3"/>
       </w:pPr>
       <w:r>
-        <w:t>Working environment</w:t>
+        <w:t>S</w:t>
+      </w:r>
+      <w:r>
+        <w:t>ource code</w:t>
+      </w:r>
+    </w:p>
+    <w:p>
+      <w:r>
+        <w:t>The author wrote all of the source code except for the Google Maps API. The author looked at numerous examples and tutorials in order to learn these technologies while implementing the system.</w:t>
+      </w:r>
+    </w:p>
+    <w:p>
+      <w:r>
+        <w:rPr>
+          <w:noProof/>
+          <w:lang w:val="en-US"/>
+        </w:rPr>
+        <mc:AlternateContent>
+          <mc:Choice Requires="wps">
+            <w:drawing>
+              <wp:anchor distT="0" distB="0" distL="114300" distR="114300" simplePos="0" relativeHeight="251657215" behindDoc="1" locked="0" layoutInCell="1" allowOverlap="1" wp14:anchorId="7AD4DB6A" wp14:editId="60BBAA9B">
+                <wp:simplePos x="0" y="0"/>
+                <wp:positionH relativeFrom="column">
+                  <wp:posOffset>-59690</wp:posOffset>
+                </wp:positionH>
+                <wp:positionV relativeFrom="paragraph">
+                  <wp:posOffset>1694066</wp:posOffset>
+                </wp:positionV>
+                <wp:extent cx="5829300" cy="1600200"/>
+                <wp:effectExtent l="0" t="0" r="38100" b="25400"/>
+                <wp:wrapNone/>
+                <wp:docPr id="8" name="Rectangle 8"/>
+                <wp:cNvGraphicFramePr/>
+                <a:graphic xmlns:a="http://schemas.openxmlformats.org/drawingml/2006/main">
+                  <a:graphicData uri="http://schemas.microsoft.com/office/word/2010/wordprocessingShape">
+                    <wps:wsp>
+                      <wps:cNvSpPr/>
+                      <wps:spPr>
+                        <a:xfrm>
+                          <a:off x="0" y="0"/>
+                          <a:ext cx="5829300" cy="1600200"/>
+                        </a:xfrm>
+                        <a:prstGeom prst="rect">
+                          <a:avLst/>
+                        </a:prstGeom>
+                        <a:noFill/>
+                        <a:ln>
+                          <a:solidFill>
+                            <a:schemeClr val="tx1"/>
+                          </a:solidFill>
+                        </a:ln>
+                        <a:effectLst/>
+                      </wps:spPr>
+                      <wps:style>
+                        <a:lnRef idx="1">
+                          <a:schemeClr val="accent1"/>
+                        </a:lnRef>
+                        <a:fillRef idx="3">
+                          <a:schemeClr val="accent1"/>
+                        </a:fillRef>
+                        <a:effectRef idx="2">
+                          <a:schemeClr val="accent1"/>
+                        </a:effectRef>
+                        <a:fontRef idx="minor">
+                          <a:schemeClr val="lt1"/>
+                        </a:fontRef>
+                      </wps:style>
+                      <wps:bodyPr rot="0" spcFirstLastPara="0" vertOverflow="overflow" horzOverflow="overflow" vert="horz" wrap="square" lIns="91440" tIns="45720" rIns="91440" bIns="45720" numCol="1" spcCol="0" rtlCol="0" fromWordArt="0" anchor="ctr" anchorCtr="0" forceAA="0" compatLnSpc="1">
+                        <a:prstTxWarp prst="textNoShape">
+                          <a:avLst/>
+                        </a:prstTxWarp>
+                        <a:noAutofit/>
+                      </wps:bodyPr>
+                    </wps:wsp>
+                  </a:graphicData>
+                </a:graphic>
+              </wp:anchor>
+            </w:drawing>
+          </mc:Choice>
+          <mc:Fallback>
+            <w:pict>
+              <v:rect id="Rectangle 8" o:spid="_x0000_s1026" style="position:absolute;margin-left:-4.65pt;margin-top:133.4pt;width:459pt;height:126pt;z-index:-251659265;visibility:visible;mso-wrap-style:square;mso-wrap-distance-left:9pt;mso-wrap-distance-top:0;mso-wrap-distance-right:9pt;mso-wrap-distance-bottom:0;mso-position-horizontal:absolute;mso-position-horizontal-relative:text;mso-position-vertical:absolute;mso-position-vertical-relative:text;v-text-anchor:middle" o:gfxdata="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" filled="f" strokecolor="black [3213]"/>
+            </w:pict>
+          </mc:Fallback>
+        </mc:AlternateContent>
+      </w:r>
+      <w:r>
+        <w:t>In the code snippet below</w:t>
+      </w:r>
+      <w:r>
+        <w:t xml:space="preserve"> validates administrator login details. Y</w:t>
+      </w:r>
+      <w:r>
+        <w:t xml:space="preserve">ou can see </w:t>
+      </w:r>
+      <w:r>
+        <w:t xml:space="preserve">the SQL command is select everything from the admin table where the </w:t>
+      </w:r>
+      <w:r>
+        <w:t>“</w:t>
+      </w:r>
+      <w:proofErr w:type="spellStart"/>
+      <w:r>
+        <w:rPr>
+          <w:i/>
+        </w:rPr>
+        <w:t>uname</w:t>
+      </w:r>
+      <w:proofErr w:type="spellEnd"/>
+      <w:r>
+        <w:t>”</w:t>
+      </w:r>
+      <w:r>
+        <w:t xml:space="preserve"> field matches the </w:t>
+      </w:r>
+      <w:r>
+        <w:t>“</w:t>
+      </w:r>
+      <w:proofErr w:type="spellStart"/>
+      <w:r>
+        <w:rPr>
+          <w:i/>
+        </w:rPr>
+        <w:t>userid</w:t>
+      </w:r>
+      <w:proofErr w:type="spellEnd"/>
+      <w:r>
+        <w:t>”</w:t>
+      </w:r>
+      <w:r>
+        <w:t xml:space="preserve"> field and the </w:t>
+      </w:r>
+      <w:r>
+        <w:t>“</w:t>
+      </w:r>
+      <w:r>
+        <w:rPr>
+          <w:i/>
+        </w:rPr>
+        <w:t>pass</w:t>
+      </w:r>
+      <w:r>
+        <w:t>”</w:t>
+      </w:r>
+      <w:r>
+        <w:t xml:space="preserve"> field matches the </w:t>
+      </w:r>
+      <w:r>
+        <w:t>“</w:t>
+      </w:r>
+      <w:proofErr w:type="spellStart"/>
+      <w:r>
+        <w:rPr>
+          <w:i/>
+        </w:rPr>
+        <w:t>pwd</w:t>
+      </w:r>
+      <w:proofErr w:type="spellEnd"/>
+      <w:r>
+        <w:t>”</w:t>
+      </w:r>
+      <w:r>
+        <w:t xml:space="preserve"> field. As well as that it checks if the admin field is equal to 1 in the database. If these are all true, then the JSP code sets the session attribute </w:t>
+      </w:r>
+      <w:r>
+        <w:t>“</w:t>
+      </w:r>
+      <w:proofErr w:type="spellStart"/>
+      <w:r>
+        <w:rPr>
+          <w:i/>
+        </w:rPr>
+        <w:t>userid</w:t>
+      </w:r>
+      <w:proofErr w:type="spellEnd"/>
+      <w:r>
+        <w:t>”</w:t>
+      </w:r>
+      <w:r>
+        <w:t xml:space="preserve"> to the </w:t>
+      </w:r>
+      <w:r>
+        <w:t>“</w:t>
+      </w:r>
+      <w:proofErr w:type="spellStart"/>
+      <w:r>
+        <w:rPr>
+          <w:i/>
+        </w:rPr>
+        <w:t>userid</w:t>
+      </w:r>
+      <w:proofErr w:type="spellEnd"/>
+      <w:r>
+        <w:t>”</w:t>
+      </w:r>
+      <w:r>
+        <w:t xml:space="preserve"> the user entered, it sets the session attribute to be admin as 1 and finally it directs the user to the </w:t>
+      </w:r>
+      <w:proofErr w:type="spellStart"/>
+      <w:r>
+        <w:t>admin.jsp</w:t>
+      </w:r>
+      <w:proofErr w:type="spellEnd"/>
+      <w:r>
+        <w:t xml:space="preserve"> page upon a successful login.</w:t>
       </w:r>
     </w:p>
     <w:p>
       <w:pPr>
-        <w:pStyle w:val="Heading3"/>
+        <w:rPr>
+          <w:rFonts w:asciiTheme="minorHAnsi" w:hAnsiTheme="minorHAnsi" w:cstheme="minorHAnsi"/>
+          <w:i/>
+        </w:rPr>
       </w:pPr>
-      <w:bookmarkStart w:id="72" w:name="_Toc387605651"/>
-      <w:r>
-        <w:t>Coding decisions</w:t>
-      </w:r>
-      <w:bookmarkEnd w:id="72"/>
-      <w:r>
+      <w:proofErr w:type="spellStart"/>
+      <w:proofErr w:type="gramStart"/>
+      <w:r>
+        <w:rPr>
+          <w:rFonts w:asciiTheme="minorHAnsi" w:hAnsiTheme="minorHAnsi" w:cstheme="minorHAnsi"/>
+          <w:i/>
+        </w:rPr>
+        <w:t>rs</w:t>
+      </w:r>
+      <w:proofErr w:type="spellEnd"/>
+      <w:proofErr w:type="gramEnd"/>
+      <w:r>
+        <w:rPr>
+          <w:rFonts w:asciiTheme="minorHAnsi" w:hAnsiTheme="minorHAnsi" w:cstheme="minorHAnsi"/>
+          <w:i/>
+        </w:rPr>
+        <w:t xml:space="preserve"> = </w:t>
+      </w:r>
+      <w:proofErr w:type="spellStart"/>
+      <w:r>
+        <w:rPr>
+          <w:rFonts w:asciiTheme="minorHAnsi" w:hAnsiTheme="minorHAnsi" w:cstheme="minorHAnsi"/>
+          <w:i/>
+        </w:rPr>
+        <w:t>st.executeQuery</w:t>
+      </w:r>
+      <w:proofErr w:type="spellEnd"/>
+      <w:r>
+        <w:rPr>
+          <w:rFonts w:asciiTheme="minorHAnsi" w:hAnsiTheme="minorHAnsi" w:cstheme="minorHAnsi"/>
+          <w:i/>
+        </w:rPr>
+        <w:t xml:space="preserve">("select * from admin where </w:t>
+      </w:r>
+      <w:proofErr w:type="spellStart"/>
+      <w:r>
+        <w:rPr>
+          <w:rFonts w:asciiTheme="minorHAnsi" w:hAnsiTheme="minorHAnsi" w:cstheme="minorHAnsi"/>
+          <w:i/>
+        </w:rPr>
+        <w:t>uname</w:t>
+      </w:r>
+      <w:proofErr w:type="spellEnd"/>
+      <w:r>
+        <w:rPr>
+          <w:rFonts w:asciiTheme="minorHAnsi" w:hAnsiTheme="minorHAnsi" w:cstheme="minorHAnsi"/>
+          <w:i/>
+        </w:rPr>
+        <w:t xml:space="preserve">='" + </w:t>
+      </w:r>
+      <w:proofErr w:type="spellStart"/>
+      <w:r>
+        <w:rPr>
+          <w:rFonts w:asciiTheme="minorHAnsi" w:hAnsiTheme="minorHAnsi" w:cstheme="minorHAnsi"/>
+          <w:i/>
+        </w:rPr>
+        <w:t>userid</w:t>
+      </w:r>
+      <w:proofErr w:type="spellEnd"/>
+      <w:r>
+        <w:rPr>
+          <w:rFonts w:asciiTheme="minorHAnsi" w:hAnsiTheme="minorHAnsi" w:cstheme="minorHAnsi"/>
+          <w:i/>
+        </w:rPr>
+        <w:t xml:space="preserve"> + "' and pass='" + </w:t>
+      </w:r>
+      <w:proofErr w:type="spellStart"/>
+      <w:r>
+        <w:rPr>
+          <w:rFonts w:asciiTheme="minorHAnsi" w:hAnsiTheme="minorHAnsi" w:cstheme="minorHAnsi"/>
+          <w:i/>
+        </w:rPr>
+        <w:t>pwd</w:t>
+      </w:r>
+      <w:proofErr w:type="spellEnd"/>
+      <w:r>
+        <w:rPr>
+          <w:rFonts w:asciiTheme="minorHAnsi" w:hAnsiTheme="minorHAnsi" w:cstheme="minorHAnsi"/>
+          <w:i/>
+        </w:rPr>
+        <w:t xml:space="preserve"> + "' and admin='1'");</w:t>
+      </w:r>
+      <w:r>
+        <w:rPr>
+          <w:rFonts w:asciiTheme="minorHAnsi" w:hAnsiTheme="minorHAnsi" w:cstheme="minorHAnsi"/>
+          <w:i/>
+        </w:rPr>
+        <w:br/>
+        <w:t xml:space="preserve">    if (</w:t>
+      </w:r>
+      <w:proofErr w:type="spellStart"/>
+      <w:r>
+        <w:rPr>
+          <w:rFonts w:asciiTheme="minorHAnsi" w:hAnsiTheme="minorHAnsi" w:cstheme="minorHAnsi"/>
+          <w:i/>
+        </w:rPr>
+        <w:t>rs.next</w:t>
+      </w:r>
+      <w:proofErr w:type="spellEnd"/>
+      <w:r>
+        <w:rPr>
+          <w:rFonts w:asciiTheme="minorHAnsi" w:hAnsiTheme="minorHAnsi" w:cstheme="minorHAnsi"/>
+          <w:i/>
+        </w:rPr>
+        <w:t>()) {</w:t>
+      </w:r>
+      <w:r>
+        <w:rPr>
+          <w:rFonts w:asciiTheme="minorHAnsi" w:hAnsiTheme="minorHAnsi" w:cstheme="minorHAnsi"/>
+          <w:i/>
+        </w:rPr>
+        <w:br/>
+        <w:t xml:space="preserve">    </w:t>
+      </w:r>
+      <w:r>
+        <w:rPr>
+          <w:rFonts w:asciiTheme="minorHAnsi" w:hAnsiTheme="minorHAnsi" w:cstheme="minorHAnsi"/>
+          <w:i/>
+        </w:rPr>
+        <w:tab/>
+      </w:r>
+      <w:proofErr w:type="spellStart"/>
+      <w:r>
+        <w:rPr>
+          <w:rFonts w:asciiTheme="minorHAnsi" w:hAnsiTheme="minorHAnsi" w:cstheme="minorHAnsi"/>
+          <w:i/>
+        </w:rPr>
+        <w:t>session.setAttribute</w:t>
+      </w:r>
+      <w:proofErr w:type="spellEnd"/>
+      <w:r>
+        <w:rPr>
+          <w:rFonts w:asciiTheme="minorHAnsi" w:hAnsiTheme="minorHAnsi" w:cstheme="minorHAnsi"/>
+          <w:i/>
+        </w:rPr>
+        <w:t>("</w:t>
+      </w:r>
+      <w:proofErr w:type="spellStart"/>
+      <w:r>
+        <w:rPr>
+          <w:rFonts w:asciiTheme="minorHAnsi" w:hAnsiTheme="minorHAnsi" w:cstheme="minorHAnsi"/>
+          <w:i/>
+        </w:rPr>
+        <w:t>userid</w:t>
+      </w:r>
+      <w:proofErr w:type="spellEnd"/>
+      <w:r>
+        <w:rPr>
+          <w:rFonts w:asciiTheme="minorHAnsi" w:hAnsiTheme="minorHAnsi" w:cstheme="minorHAnsi"/>
+          <w:i/>
+        </w:rPr>
+        <w:t xml:space="preserve">", </w:t>
+      </w:r>
+      <w:proofErr w:type="spellStart"/>
+      <w:r>
+        <w:rPr>
+          <w:rFonts w:asciiTheme="minorHAnsi" w:hAnsiTheme="minorHAnsi" w:cstheme="minorHAnsi"/>
+          <w:i/>
+        </w:rPr>
+        <w:t>userid</w:t>
+      </w:r>
+      <w:proofErr w:type="spellEnd"/>
+      <w:r>
+        <w:rPr>
+          <w:rFonts w:asciiTheme="minorHAnsi" w:hAnsiTheme="minorHAnsi" w:cstheme="minorHAnsi"/>
+          <w:i/>
+        </w:rPr>
+        <w:t>);</w:t>
+      </w:r>
+      <w:r>
+        <w:rPr>
+          <w:rFonts w:asciiTheme="minorHAnsi" w:hAnsiTheme="minorHAnsi" w:cstheme="minorHAnsi"/>
+          <w:i/>
+        </w:rPr>
+        <w:br/>
+        <w:t xml:space="preserve">    </w:t>
+      </w:r>
+      <w:r>
+        <w:rPr>
+          <w:rFonts w:asciiTheme="minorHAnsi" w:hAnsiTheme="minorHAnsi" w:cstheme="minorHAnsi"/>
+          <w:i/>
+        </w:rPr>
+        <w:tab/>
+      </w:r>
+      <w:proofErr w:type="spellStart"/>
+      <w:r>
+        <w:rPr>
+          <w:rFonts w:asciiTheme="minorHAnsi" w:hAnsiTheme="minorHAnsi" w:cstheme="minorHAnsi"/>
+          <w:i/>
+        </w:rPr>
+        <w:t>session.setAttribute</w:t>
+      </w:r>
+      <w:proofErr w:type="spellEnd"/>
+      <w:r>
+        <w:rPr>
+          <w:rFonts w:asciiTheme="minorHAnsi" w:hAnsiTheme="minorHAnsi" w:cstheme="minorHAnsi"/>
+          <w:i/>
+        </w:rPr>
+        <w:t>("admin", 1);</w:t>
+      </w:r>
+      <w:r>
+        <w:rPr>
+          <w:rFonts w:asciiTheme="minorHAnsi" w:hAnsiTheme="minorHAnsi" w:cstheme="minorHAnsi"/>
+          <w:i/>
+        </w:rPr>
+        <w:br/>
+        <w:t xml:space="preserve">    </w:t>
+      </w:r>
+      <w:r>
+        <w:rPr>
+          <w:rFonts w:asciiTheme="minorHAnsi" w:hAnsiTheme="minorHAnsi" w:cstheme="minorHAnsi"/>
+          <w:i/>
+        </w:rPr>
+        <w:tab/>
+      </w:r>
+      <w:proofErr w:type="spellStart"/>
+      <w:r>
+        <w:rPr>
+          <w:rFonts w:asciiTheme="minorHAnsi" w:hAnsiTheme="minorHAnsi" w:cstheme="minorHAnsi"/>
+          <w:i/>
+        </w:rPr>
+        <w:t>response.sendRedirect</w:t>
+      </w:r>
+      <w:proofErr w:type="spellEnd"/>
+      <w:r>
+        <w:rPr>
+          <w:rFonts w:asciiTheme="minorHAnsi" w:hAnsiTheme="minorHAnsi" w:cstheme="minorHAnsi"/>
+          <w:i/>
+        </w:rPr>
+        <w:t>("</w:t>
+      </w:r>
+      <w:proofErr w:type="spellStart"/>
+      <w:r>
+        <w:rPr>
+          <w:rFonts w:asciiTheme="minorHAnsi" w:hAnsiTheme="minorHAnsi" w:cstheme="minorHAnsi"/>
+          <w:i/>
+        </w:rPr>
+        <w:t>admin.jsp</w:t>
+      </w:r>
+      <w:proofErr w:type="spellEnd"/>
+      <w:r>
+        <w:rPr>
+          <w:rFonts w:asciiTheme="minorHAnsi" w:hAnsiTheme="minorHAnsi" w:cstheme="minorHAnsi"/>
+          <w:i/>
+        </w:rPr>
+        <w:t>");</w:t>
+      </w:r>
+    </w:p>
+    <w:p>
+      <w:pPr>
+        <w:rPr>
+          <w:rFonts w:asciiTheme="minorHAnsi" w:hAnsiTheme="minorHAnsi" w:cstheme="minorHAnsi"/>
+        </w:rPr>
+      </w:pPr>
+      <w:r>
+        <w:rPr>
+          <w:rFonts w:asciiTheme="minorHAnsi" w:hAnsiTheme="minorHAnsi" w:cstheme="minorHAnsi"/>
+        </w:rPr>
+        <w:br w:type="column"/>
+      </w:r>
+      <w:r>
+        <w:rPr>
+          <w:rFonts w:asciiTheme="minorHAnsi" w:hAnsiTheme="minorHAnsi" w:cstheme="minorHAnsi"/>
+        </w:rPr>
+        <w:lastRenderedPageBreak/>
+        <w:t xml:space="preserve">The snippet of code below will be on </w:t>
+      </w:r>
+      <w:r>
+        <w:rPr>
+          <w:rFonts w:asciiTheme="minorHAnsi" w:hAnsiTheme="minorHAnsi" w:cstheme="minorHAnsi"/>
+        </w:rPr>
+        <w:t>pages that</w:t>
+      </w:r>
+      <w:r>
+        <w:rPr>
+          <w:rFonts w:asciiTheme="minorHAnsi" w:hAnsiTheme="minorHAnsi" w:cstheme="minorHAnsi"/>
+        </w:rPr>
+        <w:t xml:space="preserve"> require the user to be logged in before they can access it.</w:t>
+      </w:r>
+      <w:r>
+        <w:rPr>
+          <w:noProof/>
+          <w:lang w:val="en-US"/>
+        </w:rPr>
         <w:t xml:space="preserve"> </w:t>
       </w:r>
     </w:p>
     <w:p>
       <w:pPr>
-        <w:pStyle w:val="Heading4"/>
+        <w:rPr>
+          <w:rFonts w:asciiTheme="minorHAnsi" w:hAnsiTheme="minorHAnsi" w:cstheme="minorHAnsi"/>
+          <w:i/>
+        </w:rPr>
       </w:pPr>
       <w:r>
-        <w:t>S</w:t>
-      </w:r>
-      <w:r>
-        <w:t>ource code</w:t>
+        <w:rPr>
+          <w:i/>
+          <w:noProof/>
+          <w:lang w:val="en-US"/>
+        </w:rPr>
+        <mc:AlternateContent>
+          <mc:Choice Requires="wps">
+            <w:drawing>
+              <wp:anchor distT="0" distB="0" distL="114300" distR="114300" simplePos="0" relativeHeight="251704319" behindDoc="1" locked="0" layoutInCell="1" allowOverlap="1" wp14:anchorId="4BFADA71" wp14:editId="4F51A17F">
+                <wp:simplePos x="0" y="0"/>
+                <wp:positionH relativeFrom="column">
+                  <wp:posOffset>-114300</wp:posOffset>
+                </wp:positionH>
+                <wp:positionV relativeFrom="paragraph">
+                  <wp:posOffset>-81280</wp:posOffset>
+                </wp:positionV>
+                <wp:extent cx="5829300" cy="1371600"/>
+                <wp:effectExtent l="0" t="0" r="38100" b="25400"/>
+                <wp:wrapNone/>
+                <wp:docPr id="19" name="Rectangle 19"/>
+                <wp:cNvGraphicFramePr/>
+                <a:graphic xmlns:a="http://schemas.openxmlformats.org/drawingml/2006/main">
+                  <a:graphicData uri="http://schemas.microsoft.com/office/word/2010/wordprocessingShape">
+                    <wps:wsp>
+                      <wps:cNvSpPr/>
+                      <wps:spPr>
+                        <a:xfrm>
+                          <a:off x="0" y="0"/>
+                          <a:ext cx="5829300" cy="1371600"/>
+                        </a:xfrm>
+                        <a:prstGeom prst="rect">
+                          <a:avLst/>
+                        </a:prstGeom>
+                        <a:noFill/>
+                        <a:ln>
+                          <a:solidFill>
+                            <a:schemeClr val="tx1"/>
+                          </a:solidFill>
+                        </a:ln>
+                        <a:effectLst/>
+                      </wps:spPr>
+                      <wps:style>
+                        <a:lnRef idx="1">
+                          <a:schemeClr val="accent1"/>
+                        </a:lnRef>
+                        <a:fillRef idx="3">
+                          <a:schemeClr val="accent1"/>
+                        </a:fillRef>
+                        <a:effectRef idx="2">
+                          <a:schemeClr val="accent1"/>
+                        </a:effectRef>
+                        <a:fontRef idx="minor">
+                          <a:schemeClr val="lt1"/>
+                        </a:fontRef>
+                      </wps:style>
+                      <wps:bodyPr rot="0" spcFirstLastPara="0" vertOverflow="overflow" horzOverflow="overflow" vert="horz" wrap="square" lIns="91440" tIns="45720" rIns="91440" bIns="45720" numCol="1" spcCol="0" rtlCol="0" fromWordArt="0" anchor="ctr" anchorCtr="0" forceAA="0" compatLnSpc="1">
+                        <a:prstTxWarp prst="textNoShape">
+                          <a:avLst/>
+                        </a:prstTxWarp>
+                        <a:noAutofit/>
+                      </wps:bodyPr>
+                    </wps:wsp>
+                  </a:graphicData>
+                </a:graphic>
+                <wp14:sizeRelV relativeFrom="margin">
+                  <wp14:pctHeight>0</wp14:pctHeight>
+                </wp14:sizeRelV>
+              </wp:anchor>
+            </w:drawing>
+          </mc:Choice>
+          <mc:Fallback>
+            <w:pict>
+              <v:rect id="Rectangle 19" o:spid="_x0000_s1026" style="position:absolute;margin-left:-8.95pt;margin-top:-6.35pt;width:459pt;height:108pt;z-index:-251612161;visibility:visible;mso-wrap-style:square;mso-height-percent:0;mso-wrap-distance-left:9pt;mso-wrap-distance-top:0;mso-wrap-distance-right:9pt;mso-wrap-distance-bottom:0;mso-position-horizontal:absolute;mso-position-horizontal-relative:text;mso-position-vertical:absolute;mso-position-vertical-relative:text;mso-height-percent:0;mso-height-relative:margin;v-text-anchor:middle" o:gfxdata="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" filled="f" strokecolor="black [3213]"/>
+            </w:pict>
+          </mc:Fallback>
+        </mc:AlternateContent>
+      </w:r>
+      <w:r>
+        <w:rPr>
+          <w:rFonts w:asciiTheme="minorHAnsi" w:hAnsiTheme="minorHAnsi" w:cstheme="minorHAnsi"/>
+          <w:i/>
+        </w:rPr>
+        <w:t>&lt;%</w:t>
+      </w:r>
+      <w:r>
+        <w:rPr>
+          <w:rFonts w:asciiTheme="minorHAnsi" w:hAnsiTheme="minorHAnsi" w:cstheme="minorHAnsi"/>
+          <w:i/>
+        </w:rPr>
+        <w:br/>
+      </w:r>
+      <w:proofErr w:type="gramStart"/>
+      <w:r>
+        <w:rPr>
+          <w:rFonts w:asciiTheme="minorHAnsi" w:hAnsiTheme="minorHAnsi" w:cstheme="minorHAnsi"/>
+          <w:i/>
+        </w:rPr>
+        <w:t xml:space="preserve">    if</w:t>
+      </w:r>
+      <w:proofErr w:type="gramEnd"/>
+      <w:r>
+        <w:rPr>
+          <w:rFonts w:asciiTheme="minorHAnsi" w:hAnsiTheme="minorHAnsi" w:cstheme="minorHAnsi"/>
+          <w:i/>
+        </w:rPr>
+        <w:t xml:space="preserve"> ((</w:t>
+      </w:r>
+      <w:proofErr w:type="spellStart"/>
+      <w:r>
+        <w:rPr>
+          <w:rFonts w:asciiTheme="minorHAnsi" w:hAnsiTheme="minorHAnsi" w:cstheme="minorHAnsi"/>
+          <w:i/>
+        </w:rPr>
+        <w:t>session.getAttribute</w:t>
+      </w:r>
+      <w:proofErr w:type="spellEnd"/>
+      <w:r>
+        <w:rPr>
+          <w:rFonts w:asciiTheme="minorHAnsi" w:hAnsiTheme="minorHAnsi" w:cstheme="minorHAnsi"/>
+          <w:i/>
+        </w:rPr>
+        <w:t>("</w:t>
+      </w:r>
+      <w:proofErr w:type="spellStart"/>
+      <w:r>
+        <w:rPr>
+          <w:rFonts w:asciiTheme="minorHAnsi" w:hAnsiTheme="minorHAnsi" w:cstheme="minorHAnsi"/>
+          <w:i/>
+        </w:rPr>
+        <w:t>userid</w:t>
+      </w:r>
+      <w:proofErr w:type="spellEnd"/>
+      <w:r>
+        <w:rPr>
+          <w:rFonts w:asciiTheme="minorHAnsi" w:hAnsiTheme="minorHAnsi" w:cstheme="minorHAnsi"/>
+          <w:i/>
+        </w:rPr>
+        <w:t>") == null) || (</w:t>
+      </w:r>
+      <w:proofErr w:type="spellStart"/>
+      <w:r>
+        <w:rPr>
+          <w:rFonts w:asciiTheme="minorHAnsi" w:hAnsiTheme="minorHAnsi" w:cstheme="minorHAnsi"/>
+          <w:i/>
+        </w:rPr>
+        <w:t>session.getAttribute</w:t>
+      </w:r>
+      <w:proofErr w:type="spellEnd"/>
+      <w:r>
+        <w:rPr>
+          <w:rFonts w:asciiTheme="minorHAnsi" w:hAnsiTheme="minorHAnsi" w:cstheme="minorHAnsi"/>
+          <w:i/>
+        </w:rPr>
+        <w:t>("</w:t>
+      </w:r>
+      <w:proofErr w:type="spellStart"/>
+      <w:r>
+        <w:rPr>
+          <w:rFonts w:asciiTheme="minorHAnsi" w:hAnsiTheme="minorHAnsi" w:cstheme="minorHAnsi"/>
+          <w:i/>
+        </w:rPr>
+        <w:t>userid</w:t>
+      </w:r>
+      <w:proofErr w:type="spellEnd"/>
+      <w:r>
+        <w:rPr>
+          <w:rFonts w:asciiTheme="minorHAnsi" w:hAnsiTheme="minorHAnsi" w:cstheme="minorHAnsi"/>
+          <w:i/>
+        </w:rPr>
+        <w:t xml:space="preserve">") == "")) {    </w:t>
+      </w:r>
+      <w:r>
+        <w:rPr>
+          <w:rFonts w:asciiTheme="minorHAnsi" w:hAnsiTheme="minorHAnsi" w:cstheme="minorHAnsi"/>
+          <w:i/>
+        </w:rPr>
+        <w:tab/>
+      </w:r>
+      <w:proofErr w:type="spellStart"/>
+      <w:r>
+        <w:rPr>
+          <w:rFonts w:asciiTheme="minorHAnsi" w:hAnsiTheme="minorHAnsi" w:cstheme="minorHAnsi"/>
+          <w:i/>
+        </w:rPr>
+        <w:t>response.sendRedirect</w:t>
+      </w:r>
+      <w:proofErr w:type="spellEnd"/>
+      <w:r>
+        <w:rPr>
+          <w:rFonts w:asciiTheme="minorHAnsi" w:hAnsiTheme="minorHAnsi" w:cstheme="minorHAnsi"/>
+          <w:i/>
+        </w:rPr>
+        <w:t>("</w:t>
+      </w:r>
+      <w:proofErr w:type="spellStart"/>
+      <w:r>
+        <w:rPr>
+          <w:rFonts w:asciiTheme="minorHAnsi" w:hAnsiTheme="minorHAnsi" w:cstheme="minorHAnsi"/>
+          <w:i/>
+        </w:rPr>
+        <w:t>index.jsp</w:t>
+      </w:r>
+      <w:proofErr w:type="spellEnd"/>
+      <w:r>
+        <w:rPr>
+          <w:rFonts w:asciiTheme="minorHAnsi" w:hAnsiTheme="minorHAnsi" w:cstheme="minorHAnsi"/>
+          <w:i/>
+        </w:rPr>
+        <w:t>");</w:t>
+      </w:r>
+      <w:r>
+        <w:rPr>
+          <w:rFonts w:asciiTheme="minorHAnsi" w:hAnsiTheme="minorHAnsi" w:cstheme="minorHAnsi"/>
+          <w:i/>
+        </w:rPr>
+        <w:br/>
+        <w:t xml:space="preserve">    }</w:t>
+      </w:r>
+      <w:r>
+        <w:rPr>
+          <w:rFonts w:asciiTheme="minorHAnsi" w:hAnsiTheme="minorHAnsi" w:cstheme="minorHAnsi"/>
+          <w:i/>
+        </w:rPr>
+        <w:br/>
+        <w:t>%&gt;</w:t>
+      </w:r>
+    </w:p>
+    <w:p>
+      <w:pPr>
+        <w:rPr>
+          <w:rFonts w:asciiTheme="minorHAnsi" w:hAnsiTheme="minorHAnsi" w:cstheme="minorHAnsi"/>
+        </w:rPr>
+      </w:pPr>
+      <w:r>
+        <w:rPr>
+          <w:rFonts w:asciiTheme="minorHAnsi" w:hAnsiTheme="minorHAnsi" w:cstheme="minorHAnsi"/>
+        </w:rPr>
+        <w:t xml:space="preserve">The code snippet of code above checks if the </w:t>
+      </w:r>
+      <w:r>
+        <w:rPr>
+          <w:rFonts w:asciiTheme="minorHAnsi" w:hAnsiTheme="minorHAnsi" w:cstheme="minorHAnsi"/>
+        </w:rPr>
+        <w:t>“</w:t>
+      </w:r>
+      <w:proofErr w:type="spellStart"/>
+      <w:r>
+        <w:rPr>
+          <w:rFonts w:asciiTheme="minorHAnsi" w:hAnsiTheme="minorHAnsi" w:cstheme="minorHAnsi"/>
+          <w:i/>
+        </w:rPr>
+        <w:t>userid</w:t>
+      </w:r>
+      <w:proofErr w:type="spellEnd"/>
+      <w:r>
+        <w:rPr>
+          <w:rFonts w:asciiTheme="minorHAnsi" w:hAnsiTheme="minorHAnsi" w:cstheme="minorHAnsi"/>
+        </w:rPr>
+        <w:t>”</w:t>
+      </w:r>
+      <w:r>
+        <w:rPr>
+          <w:rFonts w:asciiTheme="minorHAnsi" w:hAnsiTheme="minorHAnsi" w:cstheme="minorHAnsi"/>
+        </w:rPr>
+        <w:t xml:space="preserve"> from the session variable is </w:t>
+      </w:r>
+      <w:r>
+        <w:rPr>
+          <w:rFonts w:asciiTheme="minorHAnsi" w:hAnsiTheme="minorHAnsi" w:cstheme="minorHAnsi"/>
+        </w:rPr>
+        <w:t>“</w:t>
+      </w:r>
+      <w:r>
+        <w:rPr>
+          <w:rFonts w:asciiTheme="minorHAnsi" w:hAnsiTheme="minorHAnsi" w:cstheme="minorHAnsi"/>
+          <w:i/>
+        </w:rPr>
+        <w:t>null</w:t>
+      </w:r>
+      <w:r>
+        <w:rPr>
+          <w:rFonts w:asciiTheme="minorHAnsi" w:hAnsiTheme="minorHAnsi" w:cstheme="minorHAnsi"/>
+        </w:rPr>
+        <w:t>”</w:t>
+      </w:r>
+      <w:r>
+        <w:rPr>
+          <w:rFonts w:asciiTheme="minorHAnsi" w:hAnsiTheme="minorHAnsi" w:cstheme="minorHAnsi"/>
+        </w:rPr>
+        <w:t xml:space="preserve">. If it happens to be null then the user is directed back to the </w:t>
+      </w:r>
+      <w:proofErr w:type="spellStart"/>
+      <w:r>
+        <w:rPr>
+          <w:rFonts w:asciiTheme="minorHAnsi" w:hAnsiTheme="minorHAnsi" w:cstheme="minorHAnsi"/>
+        </w:rPr>
+        <w:t>index.jsp</w:t>
+      </w:r>
+      <w:proofErr w:type="spellEnd"/>
+      <w:r>
+        <w:rPr>
+          <w:rFonts w:asciiTheme="minorHAnsi" w:hAnsiTheme="minorHAnsi" w:cstheme="minorHAnsi"/>
+        </w:rPr>
+        <w:t xml:space="preserve"> page. Notice the user will automatically have their </w:t>
+      </w:r>
+      <w:r>
+        <w:rPr>
+          <w:rFonts w:asciiTheme="minorHAnsi" w:hAnsiTheme="minorHAnsi" w:cstheme="minorHAnsi"/>
+        </w:rPr>
+        <w:t>“</w:t>
+      </w:r>
+      <w:proofErr w:type="spellStart"/>
+      <w:r>
+        <w:rPr>
+          <w:rFonts w:asciiTheme="minorHAnsi" w:hAnsiTheme="minorHAnsi" w:cstheme="minorHAnsi"/>
+          <w:i/>
+        </w:rPr>
+        <w:t>userid</w:t>
+      </w:r>
+      <w:proofErr w:type="spellEnd"/>
+      <w:r>
+        <w:rPr>
+          <w:rFonts w:asciiTheme="minorHAnsi" w:hAnsiTheme="minorHAnsi" w:cstheme="minorHAnsi"/>
+        </w:rPr>
+        <w:t>”</w:t>
+      </w:r>
+      <w:r>
+        <w:rPr>
+          <w:rFonts w:asciiTheme="minorHAnsi" w:hAnsiTheme="minorHAnsi" w:cstheme="minorHAnsi"/>
+        </w:rPr>
+        <w:t xml:space="preserve"> set to the </w:t>
+      </w:r>
+      <w:r>
+        <w:rPr>
+          <w:rFonts w:asciiTheme="minorHAnsi" w:hAnsiTheme="minorHAnsi" w:cstheme="minorHAnsi"/>
+        </w:rPr>
+        <w:t>“</w:t>
+      </w:r>
+      <w:proofErr w:type="spellStart"/>
+      <w:r>
+        <w:rPr>
+          <w:rFonts w:asciiTheme="minorHAnsi" w:hAnsiTheme="minorHAnsi" w:cstheme="minorHAnsi"/>
+          <w:i/>
+        </w:rPr>
+        <w:t>userid</w:t>
+      </w:r>
+      <w:proofErr w:type="spellEnd"/>
+      <w:r>
+        <w:rPr>
+          <w:rFonts w:asciiTheme="minorHAnsi" w:hAnsiTheme="minorHAnsi" w:cstheme="minorHAnsi"/>
+        </w:rPr>
+        <w:t>”</w:t>
+      </w:r>
+      <w:r>
+        <w:rPr>
+          <w:rFonts w:asciiTheme="minorHAnsi" w:hAnsiTheme="minorHAnsi" w:cstheme="minorHAnsi"/>
+        </w:rPr>
+        <w:t xml:space="preserve"> they entered upon logging in, therefore if that is empty, then the user has not successfully logged n.</w:t>
       </w:r>
     </w:p>
     <w:p>
       <w:pPr>
         <w:pStyle w:val="Heading2"/>
       </w:pPr>
-      <w:bookmarkStart w:id="73" w:name="_Toc387605652"/>
+      <w:bookmarkStart w:id="70" w:name="_Toc387605652"/>
       <w:r>
         <w:t xml:space="preserve">Testing </w:t>
       </w:r>
       <w:r>
         <w:t>phase</w:t>
       </w:r>
-      <w:bookmarkEnd w:id="73"/>
+      <w:bookmarkEnd w:id="70"/>
     </w:p>
     <w:p>
       <w:r>
         <w:t xml:space="preserve">Working in an agile way meant that the author regularly tested functionality after each iteration cycle. For each iteration cycle, a series of functional requirements were targeted so the tests were done accordingly. </w:t>
       </w:r>
-    </w:p>
-    <w:p>
-      <w:pPr>
-        <w:pStyle w:val="CommentText"/>
-      </w:pPr>
-      <w:proofErr w:type="gramStart"/>
-      <w:r>
-        <w:rPr>
-          <w:highlight w:val="yellow"/>
-        </w:rPr>
-        <w:t>what</w:t>
-      </w:r>
-      <w:proofErr w:type="gramEnd"/>
-      <w:r>
-        <w:rPr>
-          <w:highlight w:val="yellow"/>
-        </w:rPr>
-        <w:t xml:space="preserve"> were the functional requirements “targeted”? You need to be specific.</w:t>
-      </w:r>
-    </w:p>
-    <w:p>
-      <w:pPr>
-        <w:pStyle w:val="CommentText"/>
-        <w:tabs>
-          <w:tab w:val="left" w:pos="7680"/>
-        </w:tabs>
-      </w:pPr>
       <w:r>
         <w:tab/>
       </w:r>
@@ -18323,9 +19118,85 @@
     </w:p>
     <w:p>
       <w:r>
+        <w:rPr>
+          <w:noProof/>
+          <w:lang w:val="en-US"/>
+        </w:rPr>
+        <w:drawing>
+          <wp:anchor distT="0" distB="0" distL="114300" distR="114300" simplePos="0" relativeHeight="251705343" behindDoc="0" locked="0" layoutInCell="1" allowOverlap="1" wp14:anchorId="29F06EE7" wp14:editId="3CAE51E2">
+            <wp:simplePos x="0" y="0"/>
+            <wp:positionH relativeFrom="column">
+              <wp:posOffset>-342900</wp:posOffset>
+            </wp:positionH>
+            <wp:positionV relativeFrom="paragraph">
+              <wp:posOffset>659130</wp:posOffset>
+            </wp:positionV>
+            <wp:extent cx="6515735" cy="1988820"/>
+            <wp:effectExtent l="0" t="0" r="12065" b="0"/>
+            <wp:wrapTight wrapText="bothSides">
+              <wp:wrapPolygon edited="0">
+                <wp:start x="0" y="0"/>
+                <wp:lineTo x="0" y="21241"/>
+                <wp:lineTo x="21556" y="21241"/>
+                <wp:lineTo x="21556" y="0"/>
+                <wp:lineTo x="0" y="0"/>
+              </wp:wrapPolygon>
+            </wp:wrapTight>
+            <wp:docPr id="22" name="Picture 22" descr="Macintosh HD:Users:Mohnish:Desktop:Screen Shot 2014-05-13 at 01.16.24.png"/>
+            <wp:cNvGraphicFramePr>
+              <a:graphicFrameLocks xmlns:a="http://schemas.openxmlformats.org/drawingml/2006/main" noChangeAspect="1"/>
+            </wp:cNvGraphicFramePr>
+            <a:graphic xmlns:a="http://schemas.openxmlformats.org/drawingml/2006/main">
+              <a:graphicData uri="http://schemas.openxmlformats.org/drawingml/2006/picture">
+                <pic:pic xmlns:pic="http://schemas.openxmlformats.org/drawingml/2006/picture">
+                  <pic:nvPicPr>
+                    <pic:cNvPr id="0" name="Picture 3" descr="Macintosh HD:Users:Mohnish:Desktop:Screen Shot 2014-05-13 at 01.16.24.png"/>
+                    <pic:cNvPicPr>
+                      <a:picLocks noChangeAspect="1" noChangeArrowheads="1"/>
+                    </pic:cNvPicPr>
+                  </pic:nvPicPr>
+                  <pic:blipFill>
+                    <a:blip r:embed="rId31">
+                      <a:extLst>
+                        <a:ext uri="{28A0092B-C50C-407E-A947-70E740481C1C}">
+                          <a14:useLocalDpi xmlns:a14="http://schemas.microsoft.com/office/drawing/2010/main" val="0"/>
+                        </a:ext>
+                      </a:extLst>
+                    </a:blip>
+                    <a:srcRect/>
+                    <a:stretch>
+                      <a:fillRect/>
+                    </a:stretch>
+                  </pic:blipFill>
+                  <pic:spPr bwMode="auto">
+                    <a:xfrm>
+                      <a:off x="0" y="0"/>
+                      <a:ext cx="6515735" cy="1988820"/>
+                    </a:xfrm>
+                    <a:prstGeom prst="rect">
+                      <a:avLst/>
+                    </a:prstGeom>
+                    <a:noFill/>
+                    <a:ln>
+                      <a:noFill/>
+                    </a:ln>
+                  </pic:spPr>
+                </pic:pic>
+              </a:graphicData>
+            </a:graphic>
+            <wp14:sizeRelH relativeFrom="page">
+              <wp14:pctWidth>0</wp14:pctWidth>
+            </wp14:sizeRelH>
+            <wp14:sizeRelV relativeFrom="page">
+              <wp14:pctHeight>0</wp14:pctHeight>
+            </wp14:sizeRelV>
+          </wp:anchor>
+        </w:drawing>
+      </w:r>
+      <w:r>
         <w:t xml:space="preserve">Performance tests were also ran on </w:t>
       </w:r>
-      <w:hyperlink r:id="rId31" w:history="1">
+      <w:hyperlink r:id="rId32" w:history="1">
         <w:r>
           <w:rPr>
             <w:rStyle w:val="Hyperlink"/>
@@ -18337,54 +19208,50 @@
         <w:t xml:space="preserve"> to ensure the web-system would perform as expected on all browsers with minimal resources used.</w:t>
       </w:r>
     </w:p>
-    <w:p>
-      <w:r>
-        <w:t xml:space="preserve">Manual testing was done </w:t>
-      </w:r>
-    </w:p>
-    <w:p>
-      <w:pPr>
+    <w:p/>
+    <w:p>
+      <w:r>
+        <w:t xml:space="preserve">Here you can see a breakdown of the page elements in “Requests” and “Bytes”. We can see it is requesting more images, but there are more bytes of java script code. This means that the java script code is only run when needed, whereas the images are loaded up at the start, which results in </w:t>
+      </w:r>
+      <w:proofErr w:type="gramStart"/>
+      <w:r>
+        <w:t>a</w:t>
+      </w:r>
+      <w:proofErr w:type="gramEnd"/>
+      <w:r>
+        <w:t xml:space="preserve"> overall faster load time from page to page.</w:t>
+      </w:r>
+    </w:p>
+    <w:p>
+      <w:r>
+        <w:t>Test scripts were also written for manual testing. Just to make sure all of the links a</w:t>
+      </w:r>
+      <w:r>
+        <w:t>nd functions worked as expected. These can be found in [</w:t>
+      </w:r>
+      <w:proofErr w:type="gramStart"/>
+      <w:r>
+        <w:rPr>
+          <w:highlight w:val="magenta"/>
+        </w:rPr>
+        <w:t>appendix</w:t>
+      </w:r>
+      <w:r>
+        <w:t xml:space="preserve"> ]</w:t>
+      </w:r>
+      <w:proofErr w:type="gramEnd"/>
+      <w:r>
         <w:rPr>
           <w:highlight w:val="yellow"/>
         </w:rPr>
-      </w:pPr>
-      <w:r>
-        <w:rPr>
-          <w:highlight w:val="yellow"/>
-        </w:rPr>
-        <w:t xml:space="preserve">What </w:t>
-      </w:r>
-      <w:proofErr w:type="gramStart"/>
-      <w:r>
-        <w:rPr>
-          <w:highlight w:val="yellow"/>
-        </w:rPr>
-        <w:t>were the performance test</w:t>
-      </w:r>
-      <w:proofErr w:type="gramEnd"/>
-      <w:r>
-        <w:rPr>
-          <w:highlight w:val="yellow"/>
-        </w:rPr>
-        <w:t xml:space="preserve"> used? What were the outcomes of the test performed? You need to be detailed about this.</w:t>
-      </w:r>
-    </w:p>
-    <w:p>
-      <w:pPr>
-        <w:pStyle w:val="CommentText"/>
-      </w:pPr>
-      <w:r>
-        <w:rPr>
-          <w:highlight w:val="yellow"/>
-        </w:rPr>
-        <w:t>The tool could be mentioned in the Literature Review, and/or as part of the Method.</w:t>
+        <w:t xml:space="preserve"> </w:t>
       </w:r>
     </w:p>
     <w:p>
       <w:pPr>
         <w:pStyle w:val="Heading2"/>
       </w:pPr>
-      <w:bookmarkStart w:id="74" w:name="_Toc387605653"/>
+      <w:bookmarkStart w:id="71" w:name="_Toc387605653"/>
       <w:r>
         <w:t>Verification</w:t>
       </w:r>
@@ -18394,7 +19261,9 @@
       <w:r>
         <w:t>valuation</w:t>
       </w:r>
-      <w:bookmarkEnd w:id="74"/>
+      <w:bookmarkStart w:id="72" w:name="_GoBack"/>
+      <w:bookmarkEnd w:id="71"/>
+      <w:bookmarkEnd w:id="72"/>
     </w:p>
     <w:p>
       <w:r>
@@ -18416,7 +19285,6 @@
         </w:rPr>
       </w:pPr>
       <w:r>
-        <w:lastRenderedPageBreak/>
         <w:t xml:space="preserve"> </w:t>
       </w:r>
       <w:proofErr w:type="gramStart"/>
@@ -18732,6 +19600,7 @@
         <w:pStyle w:val="Heading1"/>
       </w:pPr>
       <w:r>
+        <w:lastRenderedPageBreak/>
         <w:t>Conclusions</w:t>
       </w:r>
       <w:r>
@@ -18756,21 +19625,21 @@
       <w:pPr>
         <w:pStyle w:val="Heading1"/>
       </w:pPr>
-      <w:bookmarkStart w:id="75" w:name="_Toc387605657"/>
+      <w:bookmarkStart w:id="73" w:name="_Toc387605657"/>
       <w:r>
         <w:t>References chapter</w:t>
       </w:r>
-      <w:bookmarkEnd w:id="75"/>
+      <w:bookmarkEnd w:id="73"/>
     </w:p>
     <w:p>
       <w:pPr>
         <w:pStyle w:val="Heading1"/>
       </w:pPr>
-      <w:bookmarkStart w:id="76" w:name="_Toc387605658"/>
+      <w:bookmarkStart w:id="74" w:name="_Toc387605658"/>
       <w:r>
         <w:t>Appendices</w:t>
       </w:r>
-      <w:bookmarkEnd w:id="76"/>
+      <w:bookmarkEnd w:id="74"/>
       <w:r>
         <w:t xml:space="preserve"> </w:t>
       </w:r>
@@ -18787,14 +19656,14 @@
           <w:highlight w:val="yellow"/>
         </w:rPr>
       </w:pPr>
-      <w:bookmarkStart w:id="77" w:name="_Toc387605659"/>
+      <w:bookmarkStart w:id="75" w:name="_Toc387605659"/>
       <w:r>
         <w:rPr>
           <w:highlight w:val="yellow"/>
         </w:rPr>
         <w:t>Client emails/ Meeting minutes</w:t>
       </w:r>
-      <w:bookmarkEnd w:id="77"/>
+      <w:bookmarkEnd w:id="75"/>
       <w:r>
         <w:rPr>
           <w:highlight w:val="yellow"/>
@@ -18898,15 +19767,7 @@
                 <w:szCs w:val="24"/>
                 <w:highlight w:val="yellow"/>
               </w:rPr>
-              <w:t xml:space="preserve">This consists of all the requirements set from the client via regular meetings and emails sent within the project. These documents are assigned/ signed to ensure they were asked to be delivered and are </w:t>
-            </w:r>
-            <w:r>
-              <w:rPr>
-                <w:szCs w:val="24"/>
-                <w:highlight w:val="yellow"/>
-              </w:rPr>
-              <w:lastRenderedPageBreak/>
-              <w:t>met by the author.</w:t>
+              <w:t>This consists of all the requirements set from the client via regular meetings and emails sent within the project. These documents are assigned/ signed to ensure they were asked to be delivered and are met by the author.</w:t>
             </w:r>
           </w:p>
         </w:tc>
@@ -18930,7 +19791,6 @@
                 <w:szCs w:val="24"/>
                 <w:highlight w:val="yellow"/>
               </w:rPr>
-              <w:lastRenderedPageBreak/>
               <w:t xml:space="preserve">Purpose: </w:t>
             </w:r>
           </w:p>
@@ -19066,7 +19926,7 @@
           <w:tab w:val="left" w:pos="6686"/>
         </w:tabs>
       </w:pPr>
-      <w:bookmarkStart w:id="78" w:name="_Toc387605660"/>
+      <w:bookmarkStart w:id="76" w:name="_Toc387605660"/>
     </w:p>
     <w:p/>
     <w:p/>
@@ -19084,14 +19944,14 @@
     <w:p/>
     <w:p/>
     <w:p/>
-    <w:bookmarkEnd w:id="78"/>
+    <w:bookmarkEnd w:id="76"/>
     <w:p>
       <w:pPr>
         <w:spacing w:after="120"/>
       </w:pPr>
     </w:p>
     <w:sectPr>
-      <w:footerReference w:type="default" r:id="rId32"/>
+      <w:footerReference w:type="default" r:id="rId33"/>
       <w:pgSz w:w="11906" w:h="16838"/>
       <w:pgMar w:top="1440" w:right="1440" w:bottom="1440" w:left="1440" w:header="708" w:footer="708" w:gutter="0"/>
       <w:cols w:space="708"/>
@@ -19284,7 +20144,7 @@
                                           <w:sz w:val="48"/>
                                           <w:szCs w:val="44"/>
                                         </w:rPr>
-                                        <w:t>30</w:t>
+                                        <w:t>32</w:t>
                                       </w:r>
                                       <w:r>
                                         <w:rPr>
@@ -22577,7 +23437,7 @@
 </file>
 
 <file path=customXml/itemProps1.xml><?xml version="1.0" encoding="utf-8"?>
-<ds:datastoreItem xmlns:ds="http://schemas.openxmlformats.org/officeDocument/2006/customXml" ds:itemID="{6DA57815-5270-F94A-A35C-EFB2C0DFE1A9}">
+<ds:datastoreItem xmlns:ds="http://schemas.openxmlformats.org/officeDocument/2006/customXml" ds:itemID="{0AE112E6-0964-3A41-BDE3-A805EAEC82E4}">
   <ds:schemaRefs>
     <ds:schemaRef ds:uri="http://schemas.openxmlformats.org/officeDocument/2006/bibliography"/>
   </ds:schemaRefs>

</xml_diff>